<commit_message>
Adiciona PHP como curso, nao como experiencia (TASK-831)
Pedido da Marlabs. Entra em 'Certificacoes e Cursos' (secoes unificadas para
caber em 2 paginas), nao em Competencias Tecnicas: casa a keyword no ATS sem
sugerir uso em producao. Site espelha em cv-raw.courses.

Claude-Session: https://claude.ai/code/session_016JGQGBoD8yFFdAnKSGSSqd
</commit_message>
<xml_diff>
--- a/cv/en/Rafael Veneroso Morici - Resume.docx
+++ b/cv/en/Rafael Veneroso Morici - Resume.docx
@@ -192,7 +192,6 @@
         <w:pStyle w:val="Commarcadores"/>
       </w:pPr>
       <w:r>
-        <w:lastRenderedPageBreak/>
         <w:t>Centralized identity service (authentication and authorization) consumed by every application in the ecosystem.</w:t>
       </w:r>
     </w:p>
@@ -201,6 +200,7 @@
         <w:pStyle w:val="Commarcadores"/>
       </w:pPr>
       <w:r>
+        <w:lastRenderedPageBreak/>
         <w:t>CI/CD pipelines with GitHub Actions and segregated development, staging and production environments.</w:t>
       </w:r>
     </w:p>
@@ -389,7 +389,7 @@
         <w:pStyle w:val="Ttulo2"/>
       </w:pPr>
       <w:r>
-        <w:t>CERTIFICATIONS</w:t>
+        <w:t>CERTIFICATIONS AND COURSES</w:t>
       </w:r>
     </w:p>
     <w:p>
@@ -406,6 +406,14 @@
       </w:pPr>
       <w:r>
         <w:t>AZ-900: Microsoft Azure Fundamentals — in progress</w:t>
+      </w:r>
+    </w:p>
+    <w:p>
+      <w:pPr>
+        <w:pStyle w:val="Commarcadores"/>
+      </w:pPr>
+      <w:r>
+        <w:t>PHP — web development course</w:t>
       </w:r>
     </w:p>
     <w:p>
@@ -615,31 +623,31 @@
       </w:rPr>
     </w:lvl>
   </w:abstractNum>
-  <w:num w:numId="1" w16cid:durableId="1763601340">
+  <w:num w:numId="1" w16cid:durableId="636423520">
     <w:abstractNumId w:val="8"/>
   </w:num>
-  <w:num w:numId="2" w16cid:durableId="2057393871">
+  <w:num w:numId="2" w16cid:durableId="1587107391">
     <w:abstractNumId w:val="6"/>
   </w:num>
-  <w:num w:numId="3" w16cid:durableId="1253975642">
+  <w:num w:numId="3" w16cid:durableId="538779888">
     <w:abstractNumId w:val="5"/>
   </w:num>
-  <w:num w:numId="4" w16cid:durableId="1308127782">
+  <w:num w:numId="4" w16cid:durableId="529997833">
     <w:abstractNumId w:val="4"/>
   </w:num>
-  <w:num w:numId="5" w16cid:durableId="1467579304">
+  <w:num w:numId="5" w16cid:durableId="1472404675">
     <w:abstractNumId w:val="7"/>
   </w:num>
-  <w:num w:numId="6" w16cid:durableId="1096242679">
+  <w:num w:numId="6" w16cid:durableId="1673222275">
     <w:abstractNumId w:val="3"/>
   </w:num>
-  <w:num w:numId="7" w16cid:durableId="1986666026">
+  <w:num w:numId="7" w16cid:durableId="873035176">
     <w:abstractNumId w:val="2"/>
   </w:num>
-  <w:num w:numId="8" w16cid:durableId="1217357505">
+  <w:num w:numId="8" w16cid:durableId="1869641835">
     <w:abstractNumId w:val="1"/>
   </w:num>
-  <w:num w:numId="9" w16cid:durableId="1443375455">
+  <w:num w:numId="9" w16cid:durableId="975600542">
     <w:abstractNumId w:val="0"/>
   </w:num>
 </w:numbering>
@@ -1036,7 +1044,7 @@
     <w:qFormat/>
     <w:rsid w:val="00FC693F"/>
     <w:pPr>
-      <w:spacing w:after="60"/>
+      <w:spacing w:after="50"/>
     </w:pPr>
     <w:rPr>
       <w:rFonts w:ascii="Calibri" w:hAnsi="Calibri"/>
@@ -1078,7 +1086,7 @@
     <w:pPr>
       <w:keepNext/>
       <w:keepLines/>
-      <w:spacing w:before="160" w:after="40"/>
+      <w:spacing w:before="140" w:after="40"/>
       <w:outlineLvl w:val="1"/>
     </w:pPr>
     <w:rPr>

</xml_diff>

<commit_message>
Adiciona as skills de IA da Marlabs na experiencia (TASK-836)
Seis skills de Claude Code criadas no cliente UL Solutions: quatro geram
entidades, repositorios, controllers e testes unitarios a partir da descricao
do modelo; uma valida o modelo contra os scripts SQL de criacao das tabelas
e apresenta as inconsistencias com opcoes de correcao; e uma apoia a
resolucao de conflitos de merge. Todas aprendem e se aprimoram a cada
execucao.

Atualiza os dois markdown do curriculo (PT/EN), a experiencia da Marlabs no
site (bullets e chips de stack) e regenera DOCX/PDF.

Claude-Session: https://claude.ai/code/session_01Ap9b3p9PWfrdTySmCjwuu8
</commit_message>
<xml_diff>
--- a/cv/en/Rafael Veneroso Morici - Resume.docx
+++ b/cv/en/Rafael Veneroso Morici - Resume.docx
@@ -191,6 +191,28 @@
           <w:b w:val="0"/>
         </w:rPr>
         <w:t>Model and evolve the new system's relational database (SQL Server and PostgreSQL), with services hosted on Microsoft Azure.</w:t>
+      </w:r>
+    </w:p>
+    <w:p>
+      <w:pPr>
+        <w:pStyle w:val="ListBullet"/>
+      </w:pPr>
+      <w:r>
+        <w:rPr>
+          <w:b w:val="0"/>
+        </w:rPr>
+        <w:t>Build and maintain six AI skills (Claude Code) that automate the team's development cycle: four generate entities, repositories, controllers and unit tests from the model description; one validates the model against the table creation SQL scripts and surfaces every inconsistency to the developer along with the correction options; and one assists with merge conflict resolution.</w:t>
+      </w:r>
+    </w:p>
+    <w:p>
+      <w:pPr>
+        <w:pStyle w:val="ListBullet"/>
+      </w:pPr>
+      <w:r>
+        <w:rPr>
+          <w:b w:val="0"/>
+        </w:rPr>
+        <w:t>The skills learn from every run and improve themselves, cutting rework on the following rounds.</w:t>
       </w:r>
     </w:p>
     <w:p>

</xml_diff>

<commit_message>
Adiciona a pos em IA Aplicada e reduz os curriculos a 1 pagina (TASK-837)
Pos-graduacao em Engenharia de Software em IA Aplicada (UNIPDS, set/2026 -
previsao 2027) entra na formacao do site (com selo "em andamento"), nos facts,
no resumo e nos dois curriculos.

Os .md foram reescritos enxutos: os 5 empregos continuam na linha do tempo,
com bullets condensados e as secoes de formacao/certificacoes/idiomas unidas.
O build.py fechou o restante com espacamento e margens (fonte segue 10pt).
Verificado: PT e EN saem em 1 pagina.

Claude-Session: https://claude.ai/code/session_01NSac1fZdAnWLUVC4Ep12MD
</commit_message>
<xml_diff>
--- a/cv/en/Rafael Veneroso Morici - Resume.docx
+++ b/cv/en/Rafael Veneroso Morici - Resume.docx
@@ -16,7 +16,7 @@
         <w:rPr>
           <w:b w:val="0"/>
         </w:rPr>
-        <w:t>Senior Software Engineer | .NET · C# · Azure · Domain Modeling</w:t>
+        <w:t>Senior Software Engineer | .NET · C# · Azure · Applied AI</w:t>
       </w:r>
     </w:p>
     <w:p>
@@ -24,7 +24,7 @@
         <w:rPr>
           <w:b w:val="0"/>
         </w:rPr>
-        <w:t>Belo Horizonte, Brazil — available for remote work</w:t>
+        <w:t>Belo Horizonte, Brazil — available for remote work | +55 31 98239-5560 | rvenerosomorici@gmail.com</w:t>
       </w:r>
     </w:p>
     <w:p>
@@ -32,39 +32,7 @@
         <w:rPr>
           <w:b w:val="0"/>
         </w:rPr>
-        <w:t>Phone: +55 31 98239-5560</w:t>
-      </w:r>
-    </w:p>
-    <w:p>
-      <w:r>
-        <w:rPr>
-          <w:b w:val="0"/>
-        </w:rPr>
-        <w:t>Email: rvenerosomorici@gmail.com</w:t>
-      </w:r>
-    </w:p>
-    <w:p>
-      <w:r>
-        <w:rPr>
-          <w:b w:val="0"/>
-        </w:rPr>
-        <w:t>Online resume: rvmtech.com.br/en</w:t>
-      </w:r>
-    </w:p>
-    <w:p>
-      <w:r>
-        <w:rPr>
-          <w:b w:val="0"/>
-        </w:rPr>
-        <w:t>LinkedIn: linkedin.com/in/rafael-veneroso-morici</w:t>
-      </w:r>
-    </w:p>
-    <w:p>
-      <w:r>
-        <w:rPr>
-          <w:b w:val="0"/>
-        </w:rPr>
-        <w:t>GitHub: github.com/Elfarrar</w:t>
+        <w:t>rvmtech.com.br/en | linkedin.com/in/rafael-veneroso-morici | github.com/Elfarrar</w:t>
       </w:r>
     </w:p>
     <w:p>
@@ -80,7 +48,7 @@
         <w:rPr>
           <w:b w:val="0"/>
         </w:rPr>
-        <w:t>Software engineer with 15+ years of experience building enterprise systems in C# and .NET end to end — from domain modeling to production deployment. Serves as a technical reference within the team and has led a squad as team lead, contributing to architecture decisions and supporting other developers. Background in ERP, banking, people management platforms and, currently, carbon emission calculation. Hands-on with Vertical Slice Architecture (VSA), layered architecture and Domain-Driven Design (DDD), REST APIs, Blazor, SQL Server and PostgreSQL, containerization with Docker and CI/CD pipelines on Microsoft Azure and Google Cloud Platform. Advanced English, working daily with a distributed international team.</w:t>
+        <w:t>15+ years building enterprise systems in C# and .NET end to end — from domain modeling to production — across ERP, banking, people management and, currently, carbon emission calculation. Technical reference within the team and former squad tech lead. Applies AI agents across the development cycle and is taking a postgraduate program in Software Engineering for Applied AI. Advanced English, in a distributed international team.</w:t>
       </w:r>
     </w:p>
     <w:p>
@@ -94,57 +62,57 @@
     <w:p>
       <w:r>
         <w:rPr>
+          <w:b/>
+        </w:rPr>
+        <w:t>Languages and Frameworks:</w:t>
+      </w:r>
+      <w:r>
+        <w:rPr>
           <w:b w:val="0"/>
         </w:rPr>
-        <w:t>Languages and Frameworks: C#, .NET, .NET Core, .NET 10, ASP.NET, ASP.NET Core MVC, REST Web API, Blazor (Server and WebAssembly), Entity Framework Core, WPF, WCF, Web Forms, Python, JavaScript, HTML5, CSS3, Angular</w:t>
+        <w:t xml:space="preserve"> C#, .NET 10, ASP.NET Core MVC, REST Web API, Blazor, Entity Framework Core, WPF, WCF, Python, JavaScript, Angular</w:t>
       </w:r>
     </w:p>
     <w:p>
       <w:r>
         <w:rPr>
+          <w:b/>
+        </w:rPr>
+        <w:t>Architecture and Methods:</w:t>
+      </w:r>
+      <w:r>
+        <w:rPr>
           <w:b w:val="0"/>
         </w:rPr>
-        <w:t>Architecture: Vertical Slice Architecture (VSA), Domain-Driven Design (DDD), layered architecture, REST APIs, system integration, multi-tenant services, authentication and authorization (OAuth 2.0 / OpenID Connect)</w:t>
+        <w:t xml:space="preserve"> Vertical Slice Architecture (VSA), Domain-Driven Design (DDD), layered architecture, REST APIs, multi-tenant, OAuth 2.0 / OIDC, Scrum, Kanban, code review, testing</w:t>
       </w:r>
     </w:p>
     <w:p>
       <w:r>
         <w:rPr>
+          <w:b/>
+        </w:rPr>
+        <w:t>Cloud, DevOps and Data:</w:t>
+      </w:r>
+      <w:r>
+        <w:rPr>
           <w:b w:val="0"/>
         </w:rPr>
-        <w:t>Cloud and DevOps: Microsoft Azure, Google Cloud Platform (GCP), Docker, Jenkins, GitHub Actions, CI/CD, Git, Nginx, Linux</w:t>
+        <w:t xml:space="preserve"> Azure, Google Cloud, Docker, GitHub Actions, Jenkins, CI/CD, Git, Nginx, Linux · SQL Server, PostgreSQL, MySQL, T-SQL</w:t>
       </w:r>
     </w:p>
     <w:p>
       <w:r>
         <w:rPr>
-          <w:b w:val="0"/>
+          <w:b/>
         </w:rPr>
-        <w:t>Databases: SQL Server, PostgreSQL, MySQL, T-SQL</w:t>
+        <w:t>Artificial Intelligence:</w:t>
       </w:r>
-    </w:p>
-    <w:p>
       <w:r>
         <w:rPr>
           <w:b w:val="0"/>
         </w:rPr>
-        <w:t>Platforms and CMS: Sitefinity</w:t>
-      </w:r>
-    </w:p>
-    <w:p>
-      <w:r>
-        <w:rPr>
-          <w:b w:val="0"/>
-        </w:rPr>
-        <w:t>Artificial Intelligence: AI agents (Claude Code, GitHub Copilot) applied to the software development lifecycle, LLMs, vibe coding, Model Context Protocol (MCP), engineering automation</w:t>
-      </w:r>
-    </w:p>
-    <w:p>
-      <w:r>
-        <w:rPr>
-          <w:b w:val="0"/>
-        </w:rPr>
-        <w:t>Methodologies: Scrum, Kanban, Jira, Code Review, Automated Testing</w:t>
+        <w:t xml:space="preserve"> AI agents (Claude Code, GitHub Copilot) in the development cycle, LLMs, RAG, Model Context Protocol (MCP)</w:t>
       </w:r>
     </w:p>
     <w:p>
@@ -160,15 +128,13 @@
         <w:rPr>
           <w:b/>
         </w:rPr>
-        <w:t>Marlabs — Belo Horizonte, Brazil (remote)</w:t>
+        <w:t>Marlabs</w:t>
       </w:r>
-    </w:p>
-    <w:p>
       <w:r>
         <w:rPr>
           <w:b w:val="0"/>
         </w:rPr>
-        <w:t>Senior Software Developer — client: UL Solutions | Jun 2026 – Present</w:t>
+        <w:t xml:space="preserve"> — Senior Software Developer, client: UL Solutions | remote | Jun 2026 – Present</w:t>
       </w:r>
     </w:p>
     <w:p>
@@ -179,7 +145,7 @@
         <w:rPr>
           <w:b w:val="0"/>
         </w:rPr>
-        <w:t>Develop the new greenhouse gas (carbon footprint) calculation platform in C# and .NET with REST APIs, set to replace the legacy system that serves UL Solutions' enterprise clients.</w:t>
+        <w:t>New greenhouse gas calculation platform in C# and .NET with REST APIs, replacing the legacy system that serves UL Solutions' enterprise clients; database modeling (SQL Server, PostgreSQL) and services on Azure.</w:t>
       </w:r>
     </w:p>
     <w:p>
@@ -190,7 +156,21 @@
         <w:rPr>
           <w:b w:val="0"/>
         </w:rPr>
-        <w:t>Model and evolve the new system's relational database (SQL Server and PostgreSQL), with services hosted on Microsoft Azure.</w:t>
+        <w:t>Six AI skills (Claude Code) that generate entities, repositories, controllers and tests from the model, validate the model against the table creation SQL scripts and assist with merge conflicts — learning on every run.</w:t>
+      </w:r>
+    </w:p>
+    <w:p>
+      <w:r>
+        <w:rPr>
+          <w:b/>
+        </w:rPr>
+        <w:t>Independent Projects — RVM Ecosystem</w:t>
+      </w:r>
+      <w:r>
+        <w:rPr>
+          <w:b w:val="0"/>
+        </w:rPr>
+        <w:t xml:space="preserve"> — Software Engineer | Feb 2026 – Jun 2026</w:t>
       </w:r>
     </w:p>
     <w:p>
@@ -201,7 +181,7 @@
         <w:rPr>
           <w:b w:val="0"/>
         </w:rPr>
-        <w:t>Build and maintain six AI skills (Claude Code) that automate the team's development cycle: four generate entities, repositories, controllers and unit tests from the model description; one validates the model against the table creation SQL scripts and surfaces every inconsistency to the developer along with the correction options; and one assists with merge conflict resolution.</w:t>
+        <w:t>.NET 10 ecosystem from scratch to production on Vertical Slice Architecture, with Blazor Server, EF Core and PostgreSQL, on a Linux VPS with Docker, Nginx and CI/CD on GitHub Actions.</w:t>
       </w:r>
     </w:p>
     <w:p>
@@ -212,7 +192,21 @@
         <w:rPr>
           <w:b w:val="0"/>
         </w:rPr>
-        <w:t>The skills learn from every run and improve themselves, cutting rework on the following rounds.</w:t>
+        <w:t>ERPAgro: ERP for small-scale farmers operated through WhatsApp in natural language (MCP layer), generating the Brazilian LCDPR tax report; plus payment (Pix, bank slip, card) and centralized identity services.</w:t>
+      </w:r>
+    </w:p>
+    <w:p>
+      <w:r>
+        <w:rPr>
+          <w:b/>
+        </w:rPr>
+        <w:t>Questrade</w:t>
+      </w:r>
+      <w:r>
+        <w:rPr>
+          <w:b w:val="0"/>
+        </w:rPr>
+        <w:t xml:space="preserve"> — Senior Software Developer | Belo Horizonte, Brazil | Jun 2019 – Jan 2026</w:t>
       </w:r>
     </w:p>
     <w:p>
@@ -223,23 +217,7 @@
         <w:rPr>
           <w:b w:val="0"/>
         </w:rPr>
-        <w:t>Work within a distributed international team, running ceremonies, code reviews and documentation in English.</w:t>
-      </w:r>
-    </w:p>
-    <w:p>
-      <w:r>
-        <w:rPr>
-          <w:b/>
-        </w:rPr>
-        <w:t>Independent Projects — RVM Ecosystem</w:t>
-      </w:r>
-    </w:p>
-    <w:p>
-      <w:r>
-        <w:rPr>
-          <w:b w:val="0"/>
-        </w:rPr>
-        <w:t>Software Engineer | Feb 2026 – Jun 2026</w:t>
+        <w:t>The bank's web systems in C# and .NET on top of the Sitefinity CMS, which sustained peaks of over 10,000 account openings per day during the pandemic.</w:t>
       </w:r>
     </w:p>
     <w:p>
@@ -250,7 +228,7 @@
         <w:rPr>
           <w:b w:val="0"/>
         </w:rPr>
-        <w:t>Designed and built, from scratch to production, an ecosystem of applications using Vertical Slice Architecture (VSA), on .NET 10, Blazor Server, Entity Framework Core and PostgreSQL, deployed to a Linux VPS with Docker, Nginx and SSL.</w:t>
+        <w:t>Technical reference of a 6-developer team within the first year: architecture decisions, support on complex problems and leading code reviews.</w:t>
       </w:r>
     </w:p>
     <w:p>
@@ -261,7 +239,21 @@
         <w:rPr>
           <w:b w:val="0"/>
         </w:rPr>
-        <w:t>ERPAgro: vertical ERP for small-scale farmers, operated through WhatsApp in natural language (MCP layer) and complemented by a web admin panel; generates the Brazilian LCDPR tax report for accountants.</w:t>
+        <w:t>Technical owner of the affiliate and partner systems (50+ active): commission rules, REST APIs and integrations, in a regulated financial environment, communicating daily in English with Canada.</w:t>
+      </w:r>
+    </w:p>
+    <w:p>
+      <w:r>
+        <w:rPr>
+          <w:b/>
+        </w:rPr>
+        <w:t>Mereo</w:t>
+      </w:r>
+      <w:r>
+        <w:rPr>
+          <w:b w:val="0"/>
+        </w:rPr>
+        <w:t xml:space="preserve"> — Senior Software Developer / Team Lead | Belo Horizonte, Brazil | Jul 2018 – Jun 2019</w:t>
       </w:r>
     </w:p>
     <w:p>
@@ -272,7 +264,21 @@
         <w:rPr>
           <w:b w:val="0"/>
         </w:rPr>
-        <w:t>Payments service: Pix, bank slip and credit card billing, abstracting multiple providers (Asaas and Inter), with per-application data isolation via API Key and signed webhooks.</w:t>
+        <w:t>Led 3 developers and 1 QA on the performance review module of an HR management SaaS (nine box matrix and succession planning), in C# with ASP.NET, Angular 2 and SQL Server.</w:t>
+      </w:r>
+    </w:p>
+    <w:p>
+      <w:r>
+        <w:rPr>
+          <w:b/>
+        </w:rPr>
+        <w:t>EMC</w:t>
+      </w:r>
+      <w:r>
+        <w:rPr>
+          <w:b w:val="0"/>
+        </w:rPr>
+        <w:t xml:space="preserve"> — Mid-level Software Developer | Belo Horizonte, Brazil | Jan 2017 – Jul 2018</w:t>
       </w:r>
     </w:p>
     <w:p>
@@ -283,220 +289,7 @@
         <w:rPr>
           <w:b w:val="0"/>
         </w:rPr>
-        <w:t>Centralized identity service (authentication and authorization) consumed by every application in the ecosystem.</w:t>
-      </w:r>
-    </w:p>
-    <w:p>
-      <w:pPr>
-        <w:pStyle w:val="ListBullet"/>
-      </w:pPr>
-      <w:r>
-        <w:rPr>
-          <w:b w:val="0"/>
-        </w:rPr>
-        <w:t>CI/CD pipelines with GitHub Actions and segregated development, staging and production environments.</w:t>
-      </w:r>
-    </w:p>
-    <w:p>
-      <w:pPr>
-        <w:pStyle w:val="ListBullet"/>
-      </w:pPr>
-      <w:r>
-        <w:rPr>
-          <w:b w:val="0"/>
-        </w:rPr>
-        <w:t>Used AI agents as an engineering tool across the whole cycle: specification, implementation, code review and deployment.</w:t>
-      </w:r>
-    </w:p>
-    <w:p>
-      <w:r>
-        <w:rPr>
-          <w:b/>
-        </w:rPr>
-        <w:t>Questrade — Belo Horizonte, Brazil</w:t>
-      </w:r>
-    </w:p>
-    <w:p>
-      <w:r>
-        <w:rPr>
-          <w:b w:val="0"/>
-        </w:rPr>
-        <w:t>Senior Software Developer | Jun 2019 – Jan 2026</w:t>
-      </w:r>
-    </w:p>
-    <w:p>
-      <w:pPr>
-        <w:pStyle w:val="ListBullet"/>
-      </w:pPr>
-      <w:r>
-        <w:rPr>
-          <w:b w:val="0"/>
-        </w:rPr>
-        <w:t>Developed and maintained the bank's web systems in C# and .NET on top of the Sitefinity CMS, which sustained peaks of over 10,000 account openings per day during the pandemic.</w:t>
-      </w:r>
-    </w:p>
-    <w:p>
-      <w:pPr>
-        <w:pStyle w:val="ListBullet"/>
-      </w:pPr>
-      <w:r>
-        <w:rPr>
-          <w:b w:val="0"/>
-        </w:rPr>
-        <w:t>Recognized as the technical reference of a 6-developer team — several with 10 years at the company — within the first year: actively took part in solution architecture decisions, supported complex problem solving and led code reviews.</w:t>
-      </w:r>
-    </w:p>
-    <w:p>
-      <w:pPr>
-        <w:pStyle w:val="ListBullet"/>
-      </w:pPr>
-      <w:r>
-        <w:rPr>
-          <w:b w:val="0"/>
-        </w:rPr>
-        <w:t>Technical owner of the bank's affiliate and partner systems, covering 50+ active affiliates, including commission rules and integrations with internal systems.</w:t>
-      </w:r>
-    </w:p>
-    <w:p>
-      <w:pPr>
-        <w:pStyle w:val="ListBullet"/>
-      </w:pPr>
-      <w:r>
-        <w:rPr>
-          <w:b w:val="0"/>
-        </w:rPr>
-        <w:t>Built REST APIs and integrations across the bank's platforms.</w:t>
-      </w:r>
-    </w:p>
-    <w:p>
-      <w:pPr>
-        <w:pStyle w:val="ListBullet"/>
-      </w:pPr>
-      <w:r>
-        <w:rPr>
-          <w:b w:val="0"/>
-        </w:rPr>
-        <w:t>Worked in a regulated financial environment — security, traceability and audit requirements —, communicating daily in English with the team and business stakeholders in Canada.</w:t>
-      </w:r>
-    </w:p>
-    <w:p>
-      <w:r>
-        <w:rPr>
-          <w:b/>
-        </w:rPr>
-        <w:t>Mereo — Belo Horizonte, Brazil</w:t>
-      </w:r>
-    </w:p>
-    <w:p>
-      <w:r>
-        <w:rPr>
-          <w:b w:val="0"/>
-        </w:rPr>
-        <w:t>Senior Software Developer / Team Lead | Jul 2018 – Jun 2019</w:t>
-      </w:r>
-    </w:p>
-    <w:p>
-      <w:pPr>
-        <w:pStyle w:val="ListBullet"/>
-      </w:pPr>
-      <w:r>
-        <w:rPr>
-          <w:b w:val="0"/>
-        </w:rPr>
-        <w:t>Led a team of 3 developers and 1 QA responsible for the performance review module of a SaaS HR management platform.</w:t>
-      </w:r>
-    </w:p>
-    <w:p>
-      <w:pPr>
-        <w:pStyle w:val="ListBullet"/>
-      </w:pPr>
-      <w:r>
-        <w:rPr>
-          <w:b w:val="0"/>
-        </w:rPr>
-        <w:t>Built the employee assessment features: nine box matrix and succession planning for key positions.</w:t>
-      </w:r>
-    </w:p>
-    <w:p>
-      <w:pPr>
-        <w:pStyle w:val="ListBullet"/>
-      </w:pPr>
-      <w:r>
-        <w:rPr>
-          <w:b w:val="0"/>
-        </w:rPr>
-        <w:t>Platform in C# with ASP.NET and an Angular 2 front end, with REST APIs consumed by the web application.</w:t>
-      </w:r>
-    </w:p>
-    <w:p>
-      <w:pPr>
-        <w:pStyle w:val="ListBullet"/>
-      </w:pPr>
-      <w:r>
-        <w:rPr>
-          <w:b w:val="0"/>
-        </w:rPr>
-        <w:t>Modeled and optimized the SQL Server database.</w:t>
-      </w:r>
-    </w:p>
-    <w:p>
-      <w:r>
-        <w:rPr>
-          <w:b/>
-        </w:rPr>
-        <w:t>EMC — Belo Horizonte, Brazil</w:t>
-      </w:r>
-    </w:p>
-    <w:p>
-      <w:r>
-        <w:rPr>
-          <w:b w:val="0"/>
-        </w:rPr>
-        <w:t>Mid-level Software Developer | Jan 2017 – Jul 2018</w:t>
-      </w:r>
-    </w:p>
-    <w:p>
-      <w:pPr>
-        <w:pStyle w:val="ListBullet"/>
-      </w:pPr>
-      <w:r>
-        <w:rPr>
-          <w:b w:val="0"/>
-        </w:rPr>
-        <w:t>Built from scratch the ERP that came to run the operation of a 100+ employee company, after failed attempts to roll out off-the-shelf ERPs.</w:t>
-      </w:r>
-    </w:p>
-    <w:p>
-      <w:pPr>
-        <w:pStyle w:val="ListBullet"/>
-      </w:pPr>
-      <w:r>
-        <w:rPr>
-          <w:b w:val="0"/>
-        </w:rPr>
-        <w:t>Owned the domain modeling with Domain-Driven Design (DDD) and the design of the system's layered architecture.</w:t>
-      </w:r>
-    </w:p>
-    <w:p>
-      <w:pPr>
-        <w:pStyle w:val="ListBullet"/>
-      </w:pPr>
-      <w:r>
-        <w:rPr>
-          <w:b w:val="0"/>
-        </w:rPr>
-        <w:t>Delivered modules for IT equipment leasing — the company's core business —, service orders, contracts, finance and customer support.</w:t>
-      </w:r>
-    </w:p>
-    <w:p>
-      <w:pPr>
-        <w:pStyle w:val="ListBullet"/>
-      </w:pPr>
-      <w:r>
-        <w:rPr>
-          <w:b w:val="0"/>
-        </w:rPr>
-        <w:t>Built a WPF desktop interface for internal users and Web Forms + WCF for external clients.</w:t>
+        <w:t>ERP built from scratch, with DDD and layered architecture, that came to run the operation of a 100+ employee company: equipment leasing, service orders, contracts and finance.</w:t>
       </w:r>
     </w:p>
     <w:p>
@@ -512,7 +305,21 @@
         <w:pStyle w:val="Heading2"/>
       </w:pPr>
       <w:r>
-        <w:t>EDUCATION</w:t>
+        <w:t>EDUCATION, CERTIFICATIONS AND LANGUAGES</w:t>
+      </w:r>
+    </w:p>
+    <w:p>
+      <w:r>
+        <w:rPr>
+          <w:b/>
+        </w:rPr>
+        <w:t>Postgraduate Program in Software Engineering for Applied AI</w:t>
+      </w:r>
+      <w:r>
+        <w:rPr>
+          <w:b w:val="0"/>
+        </w:rPr>
+        <w:t xml:space="preserve"> — UNIPDS | Sep 2026 – expected 2027</w:t>
       </w:r>
     </w:p>
     <w:p>
@@ -526,7 +333,7 @@
         <w:rPr>
           <w:b w:val="0"/>
         </w:rPr>
-        <w:t xml:space="preserve"> — Faculdade Infórium de Tecnologia, Belo Horizonte, Brazil</w:t>
+        <w:t xml:space="preserve"> — Faculdade Infórium de Tecnologia | graduated 2009</w:t>
       </w:r>
     </w:p>
     <w:p>
@@ -534,83 +341,20 @@
         <w:rPr>
           <w:b w:val="0"/>
         </w:rPr>
-        <w:t>Graduated: 2009</w:t>
+        <w:t>Exam 480: Programming in HTML5 with JavaScript and CSS3 — Microsoft | AZ-900: Azure Fundamentals — in progress</w:t>
       </w:r>
     </w:p>
     <w:p>
-      <w:pPr>
-        <w:pStyle w:val="Heading2"/>
-      </w:pPr>
-      <w:r>
-        <w:t>CERTIFICATIONS AND COURSES</w:t>
-      </w:r>
-    </w:p>
-    <w:p>
-      <w:pPr>
-        <w:pStyle w:val="ListBullet"/>
-      </w:pPr>
       <w:r>
         <w:rPr>
           <w:b w:val="0"/>
         </w:rPr>
-        <w:t>Exam 480: Programming in HTML5 with JavaScript and CSS3 — Microsoft</w:t>
-      </w:r>
-    </w:p>
-    <w:p>
-      <w:pPr>
-        <w:pStyle w:val="ListBullet"/>
-      </w:pPr>
-      <w:r>
-        <w:rPr>
-          <w:b w:val="0"/>
-        </w:rPr>
-        <w:t>AZ-900: Microsoft Azure Fundamentals — in progress</w:t>
-      </w:r>
-    </w:p>
-    <w:p>
-      <w:pPr>
-        <w:pStyle w:val="ListBullet"/>
-      </w:pPr>
-      <w:r>
-        <w:rPr>
-          <w:b w:val="0"/>
-        </w:rPr>
-        <w:t>PHP — web development course</w:t>
-      </w:r>
-    </w:p>
-    <w:p>
-      <w:pPr>
-        <w:pStyle w:val="Heading2"/>
-      </w:pPr>
-      <w:r>
-        <w:t>LANGUAGES</w:t>
-      </w:r>
-    </w:p>
-    <w:p>
-      <w:pPr>
-        <w:pStyle w:val="ListBullet"/>
-      </w:pPr>
-      <w:r>
-        <w:rPr>
-          <w:b w:val="0"/>
-        </w:rPr>
-        <w:t>Portuguese: native</w:t>
-      </w:r>
-    </w:p>
-    <w:p>
-      <w:pPr>
-        <w:pStyle w:val="ListBullet"/>
-      </w:pPr>
-      <w:r>
-        <w:rPr>
-          <w:b w:val="0"/>
-        </w:rPr>
-        <w:t>English: advanced (meetings, code review and technical documentation)</w:t>
+        <w:t>Portuguese native | English advanced — meetings, code review and technical documentation</w:t>
       </w:r>
     </w:p>
     <w:sectPr>
       <w:pgSz w:w="12240" w:h="15840"/>
-      <w:pgMar w:top="737" w:right="1020" w:bottom="737" w:left="1020" w:header="720" w:footer="720" w:gutter="0"/>
+      <w:pgMar w:top="624" w:right="907" w:bottom="624" w:left="907" w:header="720" w:footer="720" w:gutter="0"/>
       <w:cols w:space="720"/>
       <w:docGrid w:linePitch="360"/>
     </w:sectPr>
@@ -982,7 +726,7 @@
     <w:qFormat/>
     <w:rsid w:val="00FC693F"/>
     <w:pPr>
-      <w:spacing w:after="50" w:before="0"/>
+      <w:spacing w:after="30" w:line="233" w:lineRule="auto" w:before="0"/>
     </w:pPr>
     <w:rPr>
       <w:rFonts w:ascii="Calibri" w:hAnsi="Calibri"/>
@@ -1068,7 +812,7 @@
     <w:pPr>
       <w:keepNext/>
       <w:keepLines/>
-      <w:spacing w:before="140" w:after="40"/>
+      <w:spacing w:before="100" w:after="40"/>
       <w:outlineLvl w:val="1"/>
     </w:pPr>
     <w:rPr>

</xml_diff>

<commit_message>
Adiciona a Practice Tek, cargo de Engenheiro e CV da vaga full stack .NET (TASK-840)
</commit_message>
<xml_diff>
--- a/cv/en/Rafael Veneroso Morici - Resume.docx
+++ b/cv/en/Rafael Veneroso Morici - Resume.docx
@@ -48,7 +48,7 @@
         <w:rPr>
           <w:b w:val="0"/>
         </w:rPr>
-        <w:t>15+ years building enterprise systems in C# and .NET end to end — from domain modeling to production — across ERP, banking, people management and, currently, carbon emission calculation. Technical reference within the team and former squad tech lead. Applies AI agents across the development cycle and is taking a postgraduate program in Software Engineering for Applied AI. Advanced English, in a distributed international team.</w:t>
+        <w:t>15+ years building enterprise systems in C# and .NET end to end — from domain modeling to production — across ERP, banking, people management, carbon emission calculation and, currently, healthcare (dental). Technical reference within the team and former squad tech lead. Applies AI agents across the development cycle and is taking a postgraduate program in Software Engineering for Applied AI. Advanced English, in a distributed international team.</w:t>
       </w:r>
     </w:p>
     <w:p>
@@ -70,7 +70,7 @@
         <w:rPr>
           <w:b w:val="0"/>
         </w:rPr>
-        <w:t xml:space="preserve"> C#, .NET 10, ASP.NET Core MVC, REST Web API, Blazor, Entity Framework Core, WPF, WCF, Python, JavaScript, Angular</w:t>
+        <w:t xml:space="preserve"> C#, .NET 10, ASP.NET Core MVC, REST Web API, Blazor, Entity Framework Core, WPF, WCF, Python, JavaScript, TypeScript, Next.js, Angular</w:t>
       </w:r>
     </w:p>
     <w:p>
@@ -98,7 +98,7 @@
         <w:rPr>
           <w:b w:val="0"/>
         </w:rPr>
-        <w:t xml:space="preserve"> Azure, Google Cloud, Docker, GitHub Actions, Jenkins, CI/CD, Git, Nginx, Linux · SQL Server, PostgreSQL, MySQL, T-SQL</w:t>
+        <w:t xml:space="preserve"> Azure, Google Cloud, Docker, GitHub Actions, Jenkins, CI/CD, Git, Nginx, Linux, WSL · SQL Server, PostgreSQL, MySQL, T-SQL</w:t>
       </w:r>
     </w:p>
     <w:p>
@@ -112,7 +112,7 @@
         <w:rPr>
           <w:b w:val="0"/>
         </w:rPr>
-        <w:t xml:space="preserve"> AI agents (Claude Code, GitHub Copilot) in the development cycle, LLMs, RAG, Model Context Protocol (MCP)</w:t>
+        <w:t xml:space="preserve"> AI agents (Claude Code, GitHub Copilot) in the development cycle, harness engineering, LLMs, RAG, Model Context Protocol (MCP)</w:t>
       </w:r>
     </w:p>
     <w:p>
@@ -134,7 +134,7 @@
         <w:rPr>
           <w:b w:val="0"/>
         </w:rPr>
-        <w:t xml:space="preserve"> — Senior Software Developer, client: UL Solutions | remote | Jun 2026 – Present</w:t>
+        <w:t xml:space="preserve"> — Senior Software Engineer | remote | Jun 2026 – Present</w:t>
       </w:r>
     </w:p>
     <w:p>
@@ -145,7 +145,7 @@
         <w:rPr>
           <w:b w:val="0"/>
         </w:rPr>
-        <w:t>New greenhouse gas calculation platform in C# and .NET with REST APIs, replacing the legacy system that serves UL Solutions' enterprise clients; database modeling (SQL Server, PostgreSQL) and services on Azure.</w:t>
+        <w:t>Client Practice Tek (Sep 2026 – Present), healthcare software: system for dental clinics in C#, .NET, TypeScript and Next.js, with SQL Server and Azure; harness engineering for AI agents (Claude Code) that automates the whole process, from code to CI.</w:t>
       </w:r>
     </w:p>
     <w:p>
@@ -156,7 +156,7 @@
         <w:rPr>
           <w:b w:val="0"/>
         </w:rPr>
-        <w:t>Six AI skills (Claude Code) that generate entities, repositories, controllers and tests from the model, validate the model against the table creation SQL scripts and assist with merge conflicts — learning on every run.</w:t>
+        <w:t>Client UL Solutions (Jun – Aug 2026): new carbon emission calculation platform in C# and .NET, replacing the legacy system; six AI skills (Claude Code) that generate entities, repositories, controllers and tests from the model and validate it against the SQL scripts.</w:t>
       </w:r>
     </w:p>
     <w:p>

</xml_diff>

<commit_message>
Practice Tek roda na AWS, nao no Azure (TASK-840)
</commit_message>
<xml_diff>
--- a/cv/en/Rafael Veneroso Morici - Resume.docx
+++ b/cv/en/Rafael Veneroso Morici - Resume.docx
@@ -98,7 +98,7 @@
         <w:rPr>
           <w:b w:val="0"/>
         </w:rPr>
-        <w:t xml:space="preserve"> Azure, Google Cloud, Docker, GitHub Actions, Jenkins, CI/CD, Git, Nginx, Linux, WSL · SQL Server, PostgreSQL, MySQL, T-SQL</w:t>
+        <w:t xml:space="preserve"> Azure, AWS, Google Cloud, Docker, GitHub Actions, Jenkins, CI/CD, Git, Nginx, Linux, WSL · SQL Server, PostgreSQL, MySQL, T-SQL</w:t>
       </w:r>
     </w:p>
     <w:p>
@@ -145,7 +145,7 @@
         <w:rPr>
           <w:b w:val="0"/>
         </w:rPr>
-        <w:t>Client Practice Tek (Sep 2026 – Present), healthcare software: system for dental clinics in C#, .NET, TypeScript and Next.js, with SQL Server and Azure; harness engineering for AI agents (Claude Code) that automates the whole process, from code to CI.</w:t>
+        <w:t>Client Practice Tek (Sep 2026 – Present), healthcare software: system for dental clinics in C#, .NET, TypeScript and Next.js, with SQL Server and AWS; harness engineering for AI agents (Claude Code) that automates the whole process, from code to CI.</w:t>
       </w:r>
     </w:p>
     <w:p>

</xml_diff>

<commit_message>
Questrade comeca em jun/2020 (Mereo ate jun/2020); estudo de caso mais humilde (TASK-849)
</commit_message>
<xml_diff>
--- a/cv/en/Rafael Veneroso Morici - Resume.docx
+++ b/cv/en/Rafael Veneroso Morici - Resume.docx
@@ -206,7 +206,7 @@
         <w:rPr>
           <w:b w:val="0"/>
         </w:rPr>
-        <w:t xml:space="preserve"> — Senior Software Developer | Belo Horizonte, Brazil | Jun 2019 – Jan 2026</w:t>
+        <w:t xml:space="preserve"> — Senior Software Developer | Belo Horizonte, Brazil | Jun 2020 – Jan 2026</w:t>
       </w:r>
     </w:p>
     <w:p>
@@ -253,7 +253,7 @@
         <w:rPr>
           <w:b w:val="0"/>
         </w:rPr>
-        <w:t xml:space="preserve"> — Senior Software Developer / Team Lead | Belo Horizonte, Brazil | Jul 2018 – Jun 2019</w:t>
+        <w:t xml:space="preserve"> — Senior Software Developer / Team Lead | Belo Horizonte, Brazil | Jul 2018 – Jun 2020</w:t>
       </w:r>
     </w:p>
     <w:p>

</xml_diff>

<commit_message>
Datas e cargos conferidos com a CTPS: EMC até jul/2019, Mereo desde jul/2019, cargos registrados — closes #22
</commit_message>
<xml_diff>
--- a/cv/en/Rafael Veneroso Morici - Resume.docx
+++ b/cv/en/Rafael Veneroso Morici - Resume.docx
@@ -134,7 +134,7 @@
         <w:rPr>
           <w:b w:val="0"/>
         </w:rPr>
-        <w:t xml:space="preserve"> — Senior Software Engineer | remote | Jun 2026 – Present</w:t>
+        <w:t xml:space="preserve"> — Full Stack Development Specialist | remote | Jun 2026 – Present</w:t>
       </w:r>
     </w:p>
     <w:p>
@@ -206,7 +206,7 @@
         <w:rPr>
           <w:b w:val="0"/>
         </w:rPr>
-        <w:t xml:space="preserve"> — Senior Software Developer | Belo Horizonte, Brazil | Jun 2020 – Jan 2026</w:t>
+        <w:t xml:space="preserve"> — Senior Full Stack Developer | Belo Horizonte, Brazil | Jun 2020 – Jan 2026</w:t>
       </w:r>
     </w:p>
     <w:p>
@@ -253,7 +253,7 @@
         <w:rPr>
           <w:b w:val="0"/>
         </w:rPr>
-        <w:t xml:space="preserve"> — Senior Software Developer / Team Lead | Belo Horizonte, Brazil | Jul 2018 – Jun 2020</w:t>
+        <w:t xml:space="preserve"> — Senior Software Developer | Belo Horizonte, Brazil | Jul 2019 – Jun 2020</w:t>
       </w:r>
     </w:p>
     <w:p>
@@ -278,7 +278,7 @@
         <w:rPr>
           <w:b w:val="0"/>
         </w:rPr>
-        <w:t xml:space="preserve"> — Mid-level Software Developer | Belo Horizonte, Brazil | Jan 2017 – Jul 2018</w:t>
+        <w:t xml:space="preserve"> — Mid-level Software Developer | Belo Horizonte, Brazil | Jan 2017 – Jul 2019</w:t>
       </w:r>
     </w:p>
     <w:p>

</xml_diff>